<commit_message>
feat: replace proxy aggregates with exact trade items
</commit_message>
<xml_diff>
--- a/public/reports/autoparts.docx
+++ b/public/reports/autoparts.docx
@@ -13,7 +13,7 @@
           <w:color w:val="000000"/>
           <w:sz w:val="44"/>
         </w:rPr>
-        <w:t>机动车零部件多来源供应与路径评估</w:t>
+        <w:t>机动车变速箱及其零件对华进口依赖与供应风险分析报告</w:t>
       </w:r>
     </w:p>
     <w:p>
@@ -27,7 +27,7 @@
           <w:color w:val="555555"/>
           <w:sz w:val="22"/>
         </w:rPr>
-        <w:t>商品：机动车零部件 / Parts and accessories of motor vehicles · 快照 2026-07-23</w:t>
+        <w:t>商品：机动车变速箱及其零件 / Gear boxes and parts thereof · 快照 2026-07-23</w:t>
       </w:r>
     </w:p>
     <w:tbl>
@@ -61,7 +61,7 @@
                 <w:color w:val="1F4D78"/>
                 <w:sz w:val="19"/>
               </w:rPr>
-              <w:t>HS2022 8位码</w:t>
+              <w:t>真实统计编码</w:t>
             </w:r>
           </w:p>
         </w:tc>
@@ -82,7 +82,7 @@
                 <w:color w:val="000000"/>
                 <w:sz w:val="19"/>
               </w:rPr>
-              <w:t>87080000</w:t>
+              <w:t>HS6 国际可比口径 870840</w:t>
             </w:r>
           </w:p>
         </w:tc>
@@ -127,7 +127,7 @@
                 <w:color w:val="000000"/>
                 <w:sz w:val="19"/>
               </w:rPr>
-              <w:t>统计口径 HS4</w:t>
+              <w:t>HS6 国际可比口径</w:t>
             </w:r>
           </w:p>
         </w:tc>
@@ -172,7 +172,7 @@
                 <w:color w:val="000000"/>
                 <w:sz w:val="19"/>
               </w:rPr>
-              <w:t>1.75 十亿美元</w:t>
+              <w:t>188.0 百万美元</w:t>
             </w:r>
           </w:p>
         </w:tc>
@@ -217,7 +217,7 @@
                 <w:color w:val="000000"/>
                 <w:sz w:val="19"/>
               </w:rPr>
-              <w:t>6.80 十亿美元</w:t>
+              <w:t>1.74 十亿美元</w:t>
             </w:r>
           </w:p>
         </w:tc>
@@ -262,7 +262,7 @@
                 <w:color w:val="000000"/>
                 <w:sz w:val="19"/>
               </w:rPr>
-              <w:t>25.8%</w:t>
+              <w:t>10.8%</w:t>
             </w:r>
           </w:p>
         </w:tc>
@@ -324,7 +324,7 @@
     </w:p>
     <w:p>
       <w:r>
-        <w:t>机动车零部件对华来源占比约四分之一，德国、日本、韩国、美国等来源共同供给；公开数据未形成可量化的第三国转口路径。</w:t>
+        <w:t>机动车变速箱及其零件在 2025 年的对华来源占比为 10.8%，应结合企业采购、原产地证书和 HS8 单证继续验证。</w:t>
       </w:r>
     </w:p>
     <w:p>
@@ -345,7 +345,7 @@
           <w:rFonts w:ascii="Microsoft YaHei" w:hAnsi="Microsoft YaHei" w:eastAsia="Microsoft YaHei"/>
           <w:sz w:val="21"/>
         </w:rPr>
-        <w:t>2025 年印度自中国进口 17.54 亿美元，全球进口 68.00 亿美元，对华来源占比 25.8%。</w:t>
+        <w:t>2025 年印度自中国进口 188.0 百万美元，全球进口 1.74 十亿美元，对华来源占比 10.8%。</w:t>
       </w:r>
     </w:p>
     <w:p>
@@ -358,7 +358,7 @@
           <w:rFonts w:ascii="Microsoft YaHei" w:hAnsi="Microsoft YaHei" w:eastAsia="Microsoft YaHei"/>
           <w:sz w:val="21"/>
         </w:rPr>
-        <w:t>印度官方议会答复将汽车零部件列为对华进口结构中的关键中间品。</w:t>
+        <w:t>页面和报告均使用真实的 HS6 国际可比口径 870840；不补零、不使用父级大类代理金额。</w:t>
       </w:r>
     </w:p>
     <w:p>
@@ -371,7 +371,7 @@
           <w:rFonts w:ascii="Microsoft YaHei" w:hAnsi="Microsoft YaHei" w:eastAsia="Microsoft YaHei"/>
           <w:sz w:val="21"/>
         </w:rPr>
-        <w:t>报告检索未能稳定重建中转额、港口和占比。</w:t>
+        <w:t>主要替代供应国或地区包括：德国、日本、韩国、美国。</w:t>
       </w:r>
     </w:p>
     <w:p>
@@ -384,12 +384,12 @@
     </w:p>
     <w:p>
       <w:r>
-        <w:t>总体依赖度不高，但电驱、电控和特定电子零件可能存在显著的中国成分暴露。</w:t>
+        <w:t>该品类的公开贸易数据能够用于识别来源集中度，但不足以替代企业级 BOM、合同、发票、原产地证书和物流单证。</w:t>
       </w:r>
     </w:p>
     <w:p>
       <w:r>
-        <w:t>印度本地装配与跨国车企供应体系会产生多国采购，不应将区域分工自动视为转口。</w:t>
+        <w:t>对第三国路径的判断应区分实质加工、区域分销、库存调拨和简单转运；金额同步变化只能作为筛查信号。</w:t>
       </w:r>
     </w:p>
     <w:p>
@@ -402,7 +402,7 @@
     </w:p>
     <w:p>
       <w:r>
-        <w:t>HS 8708 覆盖电驱、底盘、车身与安全系统等大量子类，供应商国别与零件原产地必须分开判断。</w:t>
+        <w:t>当前公开数据仅能提供路径筛查信号，不构成转口事实认定。</w:t>
       </w:r>
     </w:p>
     <w:p>
@@ -415,7 +415,7 @@
     </w:p>
     <w:p>
       <w:r>
-        <w:t>该品类的风险集中在关键子系统而非 HS4 总量。建议按车型、一级供应商和 BOM 层级开展原产地审计。</w:t>
+        <w:t>机动车变速箱及其零件应作为供应链依赖监测对象，结论准确度为 高概率。后续需用 HS8 与业务单证校验。</w:t>
       </w:r>
     </w:p>
     <w:p>
@@ -436,7 +436,7 @@
           <w:rFonts w:ascii="Microsoft YaHei" w:hAnsi="Microsoft YaHei" w:eastAsia="Microsoft YaHei"/>
           <w:sz w:val="21"/>
         </w:rPr>
-        <w:t>电驱、电控、底盘和安全系统拆分</w:t>
+        <w:t>HS8 单证与企业采购数据</w:t>
       </w:r>
     </w:p>
     <w:p>
@@ -449,7 +449,7 @@
           <w:rFonts w:ascii="Microsoft YaHei" w:hAnsi="Microsoft YaHei" w:eastAsia="Microsoft YaHei"/>
           <w:sz w:val="21"/>
         </w:rPr>
-        <w:t>一级供应商及 BOM 原产地</w:t>
+        <w:t>原产国、装运国与发票国差异</w:t>
       </w:r>
     </w:p>
     <w:p>
@@ -462,7 +462,7 @@
           <w:rFonts w:ascii="Microsoft YaHei" w:hAnsi="Microsoft YaHei" w:eastAsia="Microsoft YaHei"/>
           <w:sz w:val="21"/>
         </w:rPr>
-        <w:t>区域装配与 FTA 原产地合规</w:t>
+        <w:t>月度进口额和对华占比异常波动</w:t>
       </w:r>
     </w:p>
     <w:p>
@@ -483,7 +483,7 @@
           <w:rFonts w:ascii="Microsoft YaHei" w:hAnsi="Microsoft YaHei" w:eastAsia="Microsoft YaHei"/>
           <w:sz w:val="21"/>
         </w:rPr>
-        <w:t>研究报告第 8—9 页：HS 8708 分析</w:t>
+        <w:t>UN Comtrade 2025 / monthly API, HS 2022 (H6)</w:t>
       </w:r>
     </w:p>
     <w:p>
@@ -496,7 +496,20 @@
           <w:rFonts w:ascii="Microsoft YaHei" w:hAnsi="Microsoft YaHei" w:eastAsia="Microsoft YaHei"/>
           <w:sz w:val="21"/>
         </w:rPr>
-        <w:t>印度议会答复 4023/2025</w:t>
+        <w:t>印度 DGCI&amp;S TradeStat</w:t>
+      </w:r>
+    </w:p>
+    <w:p>
+      <w:pPr>
+        <w:pStyle w:val="ListBullet"/>
+        <w:spacing w:after="80"/>
+      </w:pPr>
+      <w:r>
+        <w:rPr>
+          <w:rFonts w:ascii="Microsoft YaHei" w:hAnsi="Microsoft YaHei" w:eastAsia="Microsoft YaHei"/>
+          <w:sz w:val="21"/>
+        </w:rPr>
+        <w:t>项目页面公开研究口径说明</w:t>
       </w:r>
     </w:p>
     <w:p>
@@ -530,7 +543,7 @@
         <w:color w:val="666666"/>
         <w:sz w:val="18"/>
       </w:rPr>
-      <w:t>机动车零部件多来源供应与路径评估 · 2026-07-23</w:t>
+      <w:t>机动车变速箱及其零件对华进口依赖与供应风险分析报告 · 2026-07-23</w:t>
     </w:r>
   </w:p>
 </w:ftr>

</xml_diff>

<commit_message>
feat: audit all trade data and route evidence
</commit_message>
<xml_diff>
--- a/public/reports/autoparts.docx
+++ b/public/reports/autoparts.docx
@@ -33,19 +33,26 @@
     <w:tbl>
       <w:tblPr>
         <w:tblStyle w:val="TableGrid"/>
-        <w:tblW w:type="auto" w:w="0"/>
         <w:jc w:val="left"/>
+        <w:tblLook w:firstColumn="1" w:firstRow="1" w:lastColumn="0" w:lastRow="0" w:noHBand="0" w:noVBand="1" w:val="04A0"/>
+        <w:tblW w:w="9360" w:type="dxa"/>
+        <w:tblInd w:w="120" w:type="dxa"/>
         <w:tblLayout w:type="fixed"/>
-        <w:tblLook w:firstColumn="1" w:firstRow="1" w:lastColumn="0" w:lastRow="0" w:noHBand="0" w:noVBand="1" w:val="04A0"/>
+        <w:tblCellMar>
+          <w:top w:w="80" w:type="dxa"/>
+          <w:start w:w="120" w:type="dxa"/>
+          <w:bottom w:w="80" w:type="dxa"/>
+          <w:end w:w="120" w:type="dxa"/>
+        </w:tblCellMar>
       </w:tblPr>
       <w:tblGrid>
-        <w:gridCol w:w="4680"/>
-        <w:gridCol w:w="4680"/>
+        <w:gridCol w:w="2300"/>
+        <w:gridCol w:w="7060"/>
       </w:tblGrid>
       <w:tr>
         <w:tc>
           <w:tcPr>
-            <w:tcW w:type="dxa" w:w="2304"/>
+            <w:tcW w:type="dxa" w:w="2300"/>
             <w:shd w:fill="F2F4F7"/>
             <w:vAlign w:val="center"/>
           </w:tcPr>
@@ -67,7 +74,7 @@
         </w:tc>
         <w:tc>
           <w:tcPr>
-            <w:tcW w:type="dxa" w:w="6912"/>
+            <w:tcW w:type="dxa" w:w="7060"/>
             <w:vAlign w:val="center"/>
           </w:tcPr>
           <w:p>
@@ -90,7 +97,7 @@
       <w:tr>
         <w:tc>
           <w:tcPr>
-            <w:tcW w:type="dxa" w:w="2304"/>
+            <w:tcW w:type="dxa" w:w="2300"/>
             <w:shd w:fill="F2F4F7"/>
             <w:vAlign w:val="center"/>
           </w:tcPr>
@@ -112,7 +119,7 @@
         </w:tc>
         <w:tc>
           <w:tcPr>
-            <w:tcW w:type="dxa" w:w="6912"/>
+            <w:tcW w:type="dxa" w:w="7060"/>
             <w:vAlign w:val="center"/>
           </w:tcPr>
           <w:p>
@@ -135,7 +142,7 @@
       <w:tr>
         <w:tc>
           <w:tcPr>
-            <w:tcW w:type="dxa" w:w="2304"/>
+            <w:tcW w:type="dxa" w:w="2300"/>
             <w:shd w:fill="F2F4F7"/>
             <w:vAlign w:val="center"/>
           </w:tcPr>
@@ -157,7 +164,7 @@
         </w:tc>
         <w:tc>
           <w:tcPr>
-            <w:tcW w:type="dxa" w:w="6912"/>
+            <w:tcW w:type="dxa" w:w="7060"/>
             <w:vAlign w:val="center"/>
           </w:tcPr>
           <w:p>
@@ -180,7 +187,7 @@
       <w:tr>
         <w:tc>
           <w:tcPr>
-            <w:tcW w:type="dxa" w:w="2304"/>
+            <w:tcW w:type="dxa" w:w="2300"/>
             <w:shd w:fill="F2F4F7"/>
             <w:vAlign w:val="center"/>
           </w:tcPr>
@@ -202,7 +209,7 @@
         </w:tc>
         <w:tc>
           <w:tcPr>
-            <w:tcW w:type="dxa" w:w="6912"/>
+            <w:tcW w:type="dxa" w:w="7060"/>
             <w:vAlign w:val="center"/>
           </w:tcPr>
           <w:p>
@@ -225,7 +232,7 @@
       <w:tr>
         <w:tc>
           <w:tcPr>
-            <w:tcW w:type="dxa" w:w="2304"/>
+            <w:tcW w:type="dxa" w:w="2300"/>
             <w:shd w:fill="F2F4F7"/>
             <w:vAlign w:val="center"/>
           </w:tcPr>
@@ -247,7 +254,7 @@
         </w:tc>
         <w:tc>
           <w:tcPr>
-            <w:tcW w:type="dxa" w:w="6912"/>
+            <w:tcW w:type="dxa" w:w="7060"/>
             <w:vAlign w:val="center"/>
           </w:tcPr>
           <w:p>
@@ -270,7 +277,7 @@
       <w:tr>
         <w:tc>
           <w:tcPr>
-            <w:tcW w:type="dxa" w:w="2304"/>
+            <w:tcW w:type="dxa" w:w="2300"/>
             <w:shd w:fill="F2F4F7"/>
             <w:vAlign w:val="center"/>
           </w:tcPr>
@@ -292,7 +299,7 @@
         </w:tc>
         <w:tc>
           <w:tcPr>
-            <w:tcW w:type="dxa" w:w="6912"/>
+            <w:tcW w:type="dxa" w:w="7060"/>
             <w:vAlign w:val="center"/>
           </w:tcPr>
           <w:p>
@@ -324,7 +331,7 @@
     </w:p>
     <w:p>
       <w:r>
-        <w:t>机动车变速箱及其零件在 2025 年的对华来源占比为 10.8%，应结合企业采购、原产地证书和 HS8 单证继续验证。</w:t>
+        <w:t>2025 年，印度进口“机动车变速箱及其零件”中来自中国的金额占比为 10.8%，按本报告阈值属于较低。该判断严格限定于 HS 2022 六位商品编码 870840，不外推至父级税目、具体企业或受控技术参数。</w:t>
       </w:r>
     </w:p>
     <w:p>
@@ -371,7 +378,7 @@
           <w:rFonts w:ascii="Microsoft YaHei" w:hAnsi="Microsoft YaHei" w:eastAsia="Microsoft YaHei"/>
           <w:sz w:val="21"/>
         </w:rPr>
-        <w:t>主要替代供应国或地区包括：德国、日本、韩国、美国。</w:t>
+        <w:t>剔除中国后，2025 年其他主要供应来源为：日本、韩国、德国、美国、泰国。</w:t>
       </w:r>
     </w:p>
     <w:p>
@@ -384,12 +391,17 @@
     </w:p>
     <w:p>
       <w:r>
-        <w:t>该品类的公开贸易数据能够用于识别来源集中度，但不足以替代企业级 BOM、合同、发票、原产地证书和物流单证。</w:t>
+        <w:t>印度自中国进口 188.0 百万美元，相对于该商品进口总额 1.74 十亿美元；比例使用未舍入金额计算，页面显示值仅作四舍五入。</w:t>
       </w:r>
     </w:p>
     <w:p>
       <w:r>
-        <w:t>对第三国路径的判断应区分实质加工、区域分销、库存调拨和简单转运；金额同步变化只能作为筛查信号。</w:t>
+        <w:t>其他供应来源按同一 HS6、同一报告国、同一年度的进口金额排序。它们说明采购来源结构，不等于已经具备同等产能、认证、交付周期或价格条件。</w:t>
+      </w:r>
+    </w:p>
+    <w:p>
+      <w:r>
+        <w:t>公开贸易数据能够识别来源集中度，但不足以替代企业级 BOM、合同、发票、原产地证书和物流单证。对受控物项还必须核对技术参数、最终用户和最终用途。</w:t>
       </w:r>
     </w:p>
     <w:p>
@@ -402,7 +414,7 @@
     </w:p>
     <w:p>
       <w:r>
-        <w:t>当前公开数据仅能提供路径筛查信号，不构成转口事实认定。</w:t>
+        <w:t>当前未取得与 HS6 870840 完全同口径且能够对应同一批货物的逐段单证闭环。即使中国至一个或多个中转国、再至印度的双边金额在同一时期同步上升，也只能作为核验线索；必须再用提单、原产地证书、发票、加工记录或公开查发案例确认。</w:t>
       </w:r>
     </w:p>
     <w:p>
@@ -415,7 +427,7 @@
     </w:p>
     <w:p>
       <w:r>
-        <w:t>机动车变速箱及其零件应作为供应链依赖监测对象，结论准确度为 高概率。后续需用 HS8 与业务单证校验。</w:t>
+        <w:t>机动车变速箱及其零件对华进口来源集中度较低，应保持常态监测。本结论准确度标注为“高概率”，仅适用于 HS6 870840 的 2025 年进口来源结构；后续若取得中国海关 HS8、企业料号和业务单证，应在不改变国际 HS6 可比口径的前提下进一步下钻。</w:t>
       </w:r>
     </w:p>
     <w:p>
@@ -436,7 +448,7 @@
           <w:rFonts w:ascii="Microsoft YaHei" w:hAnsi="Microsoft YaHei" w:eastAsia="Microsoft YaHei"/>
           <w:sz w:val="21"/>
         </w:rPr>
-        <w:t>HS8 单证与企业采购数据</w:t>
+        <w:t>HS6 870840 的月度进口金额、数量和对华来源占比</w:t>
       </w:r>
     </w:p>
     <w:p>
@@ -449,7 +461,7 @@
           <w:rFonts w:ascii="Microsoft YaHei" w:hAnsi="Microsoft YaHei" w:eastAsia="Microsoft YaHei"/>
           <w:sz w:val="21"/>
         </w:rPr>
-        <w:t>原产国、装运国与发票国差异</w:t>
+        <w:t>中国海关 HS8、企业料号与印度本国八位税号映射</w:t>
       </w:r>
     </w:p>
     <w:p>
@@ -462,7 +474,20 @@
           <w:rFonts w:ascii="Microsoft YaHei" w:hAnsi="Microsoft YaHei" w:eastAsia="Microsoft YaHei"/>
           <w:sz w:val="21"/>
         </w:rPr>
-        <w:t>月度进口额和对华占比异常波动</w:t>
+        <w:t>原产国、装运国、发票国、提单路径与实际加工工序</w:t>
+      </w:r>
+    </w:p>
+    <w:p>
+      <w:pPr>
+        <w:pStyle w:val="ListBullet"/>
+        <w:spacing w:after="80"/>
+      </w:pPr>
+      <w:r>
+        <w:rPr>
+          <w:rFonts w:ascii="Microsoft YaHei" w:hAnsi="Microsoft YaHei" w:eastAsia="Microsoft YaHei"/>
+          <w:sz w:val="21"/>
+        </w:rPr>
+        <w:t>出口许可证、技术参数、最终用户和最终用途变化</w:t>
       </w:r>
     </w:p>
     <w:p>
@@ -483,7 +508,7 @@
           <w:rFonts w:ascii="Microsoft YaHei" w:hAnsi="Microsoft YaHei" w:eastAsia="Microsoft YaHei"/>
           <w:sz w:val="21"/>
         </w:rPr>
-        <w:t>UN Comtrade 2025 / monthly API, HS 2022 (H6)</w:t>
+        <w:t>UN Comtrade 公共 API：reporterCode=699（印度）、partnerCode=0/156、flowCode=M、cmdCode=870840、period=2025；访问 2026-07-23。</w:t>
       </w:r>
     </w:p>
     <w:p>
@@ -496,7 +521,7 @@
           <w:rFonts w:ascii="Microsoft YaHei" w:hAnsi="Microsoft YaHei" w:eastAsia="Microsoft YaHei"/>
           <w:sz w:val="21"/>
         </w:rPr>
-        <w:t>印度 DGCI&amp;S TradeStat</w:t>
+        <w:t>印度 DGCI&amp;S TradeStat：月度贸易数据库与编码调整说明。</w:t>
       </w:r>
     </w:p>
     <w:p>
@@ -509,7 +534,7 @@
           <w:rFonts w:ascii="Microsoft YaHei" w:hAnsi="Microsoft YaHei" w:eastAsia="Microsoft YaHei"/>
           <w:sz w:val="21"/>
         </w:rPr>
-        <w:t>项目页面公开研究口径说明</w:t>
+        <w:t>中国商务部、海关总署及中国出口管制信息网：现行两用物项清单、公告与许可证管理目录。</w:t>
       </w:r>
     </w:p>
     <w:p>

</xml_diff>

<commit_message>
Expand downloadable Word reports
</commit_message>
<xml_diff>
--- a/public/reports/autoparts.docx
+++ b/public/reports/autoparts.docx
@@ -27,7 +27,7 @@
           <w:color w:val="555555"/>
           <w:sz w:val="22"/>
         </w:rPr>
-        <w:t>商品：机动车变速箱及其零件 / Gear boxes and parts thereof · 快照 2026-07-23</w:t>
+        <w:t>商品：机动车变速箱及其零件 / Gear boxes and parts thereof · 快照 2026-07-24</w:t>
       </w:r>
     </w:p>
     <w:tbl>
@@ -330,8 +330,52 @@
       </w:r>
     </w:p>
     <w:p>
+      <w:pPr>
+        <w:spacing w:after="120"/>
+      </w:pPr>
       <w:r>
+        <w:rPr>
+          <w:rFonts w:ascii="Microsoft YaHei" w:hAnsi="Microsoft YaHei" w:eastAsia="Microsoft YaHei"/>
+          <w:sz w:val="21"/>
+        </w:rPr>
         <w:t>2025 年，印度进口“机动车变速箱及其零件”中来自中国的金额占比为 10.8%，按本报告阈值属于较低。该判断严格限定于 HS 2022 六位商品编码 870840，不外推至父级税目、具体企业或受控技术参数。</w:t>
+      </w:r>
+      <w:r>
+        <w:rPr>
+          <w:rFonts w:ascii="Microsoft YaHei" w:hAnsi="Microsoft YaHei" w:eastAsia="Microsoft YaHei"/>
+          <w:b w:val="0"/>
+          <w:color w:val="1F4D78"/>
+          <w:sz w:val="16"/>
+          <w:vertAlign w:val="superscript"/>
+        </w:rPr>
+        <w:t>〔1〕</w:t>
+      </w:r>
+    </w:p>
+    <w:p>
+      <w:pPr>
+        <w:spacing w:after="120"/>
+      </w:pPr>
+      <w:r>
+        <w:rPr>
+          <w:rFonts w:ascii="Microsoft YaHei" w:hAnsi="Microsoft YaHei" w:eastAsia="Microsoft YaHei"/>
+          <w:sz w:val="21"/>
+        </w:rPr>
+        <w:t>机动车零部件对华来源占比约四分之一，德国、日本、韩国、美国等来源共同供给；公开数据未形成可量化的第三国转口路径。</w:t>
+      </w:r>
+      <w:r>
+        <w:rPr>
+          <w:rFonts w:ascii="Microsoft YaHei" w:hAnsi="Microsoft YaHei" w:eastAsia="Microsoft YaHei"/>
+          <w:b w:val="0"/>
+          <w:color w:val="1F4D78"/>
+          <w:sz w:val="16"/>
+          <w:vertAlign w:val="superscript"/>
+        </w:rPr>
+        <w:t>〔2〕</w:t>
+      </w:r>
+    </w:p>
+    <w:p>
+      <w:r>
+        <w:t>本报告的用途是为业务数据复核、供应链审计和出口管制策略研究提供公开来源底稿。因此，报告将“贸易统计能够证明的来源结构”和“仍需单证核验的路径推演”分开表述：前者用于判断依赖程度，后者只用于形成核验清单。</w:t>
       </w:r>
     </w:p>
     <w:p>
@@ -339,7 +383,25 @@
         <w:pStyle w:val="Heading1"/>
       </w:pPr>
       <w:r>
-        <w:t>二、数据事实</w:t>
+        <w:t>二、商品边界与统计口径</w:t>
+      </w:r>
+    </w:p>
+    <w:p>
+      <w:r>
+        <w:t>HS 870840：机动车辆用变速箱及其零件，不再与其他机动车零部件合并。</w:t>
+      </w:r>
+    </w:p>
+    <w:p>
+      <w:r>
+        <w:t>网页矩阵和本报告均优先使用真实可复核编码。当前国际比较口径为 HS6 国际可比口径 870840；如公开来源只能稳定提供 HS6，本报告即如实使用 HS6，不补零、不以父级税目金额替代具体物项。</w:t>
+      </w:r>
+    </w:p>
+    <w:p>
+      <w:pPr>
+        <w:pStyle w:val="Heading1"/>
+      </w:pPr>
+      <w:r>
+        <w:t>三、数据事实</w:t>
       </w:r>
     </w:p>
     <w:p>
@@ -352,7 +414,17 @@
           <w:rFonts w:ascii="Microsoft YaHei" w:hAnsi="Microsoft YaHei" w:eastAsia="Microsoft YaHei"/>
           <w:sz w:val="21"/>
         </w:rPr>
-        <w:t>2025 年印度自中国进口 188.0 百万美元，全球进口 1.74 十亿美元，对华来源占比 10.8%。</w:t>
+        <w:t>2025 年印度自中国进口 17.54 亿美元，全球进口 68.00 亿美元，对华来源占比 25.8%。</w:t>
+      </w:r>
+      <w:r>
+        <w:rPr>
+          <w:rFonts w:ascii="Microsoft YaHei" w:hAnsi="Microsoft YaHei" w:eastAsia="Microsoft YaHei"/>
+          <w:b w:val="0"/>
+          <w:color w:val="1F4D78"/>
+          <w:sz w:val="16"/>
+          <w:vertAlign w:val="superscript"/>
+        </w:rPr>
+        <w:t>〔3〕</w:t>
       </w:r>
     </w:p>
     <w:p>
@@ -365,7 +437,17 @@
           <w:rFonts w:ascii="Microsoft YaHei" w:hAnsi="Microsoft YaHei" w:eastAsia="Microsoft YaHei"/>
           <w:sz w:val="21"/>
         </w:rPr>
-        <w:t>页面和报告均使用真实的 HS6 国际可比口径 870840；不补零、不使用父级大类代理金额。</w:t>
+        <w:t>印度官方议会答复将汽车零部件列为对华进口结构中的关键中间品。</w:t>
+      </w:r>
+      <w:r>
+        <w:rPr>
+          <w:rFonts w:ascii="Microsoft YaHei" w:hAnsi="Microsoft YaHei" w:eastAsia="Microsoft YaHei"/>
+          <w:b w:val="0"/>
+          <w:color w:val="1F4D78"/>
+          <w:sz w:val="16"/>
+          <w:vertAlign w:val="superscript"/>
+        </w:rPr>
+        <w:t>〔4〕</w:t>
       </w:r>
     </w:p>
     <w:p>
@@ -378,7 +460,22 @@
           <w:rFonts w:ascii="Microsoft YaHei" w:hAnsi="Microsoft YaHei" w:eastAsia="Microsoft YaHei"/>
           <w:sz w:val="21"/>
         </w:rPr>
-        <w:t>剔除中国后，2025 年其他主要供应来源为：日本、韩国、德国、美国、泰国。</w:t>
+        <w:t>报告检索未能稳定重建中转额、港口和占比。</w:t>
+      </w:r>
+      <w:r>
+        <w:rPr>
+          <w:rFonts w:ascii="Microsoft YaHei" w:hAnsi="Microsoft YaHei" w:eastAsia="Microsoft YaHei"/>
+          <w:b w:val="0"/>
+          <w:color w:val="1F4D78"/>
+          <w:sz w:val="16"/>
+          <w:vertAlign w:val="superscript"/>
+        </w:rPr>
+        <w:t>〔5〕</w:t>
+      </w:r>
+    </w:p>
+    <w:p>
+      <w:r>
+        <w:t>上述金额均为现价美元口径。印度进口统计通常采用 CIF 进口口径；中国海关出口镜像采用中国出口统计口径。两类口径可以互相校验方向和异常，但不能直接相加或替代。</w:t>
       </w:r>
     </w:p>
     <w:p>
@@ -386,22 +483,846 @@
         <w:pStyle w:val="Heading1"/>
       </w:pPr>
       <w:r>
-        <w:t>三、分析</w:t>
+        <w:t>四、中国海关 HS8 出口镜像</w:t>
       </w:r>
     </w:p>
     <w:p>
+      <w:pPr>
+        <w:spacing w:after="120"/>
+      </w:pPr>
       <w:r>
-        <w:t>印度自中国进口 188.0 百万美元，相对于该商品进口总额 1.74 十亿美元；比例使用未舍入金额计算，页面显示值仅作四舍五入。</w:t>
+        <w:rPr>
+          <w:rFonts w:ascii="Microsoft YaHei" w:hAnsi="Microsoft YaHei" w:eastAsia="Microsoft YaHei"/>
+          <w:sz w:val="21"/>
+        </w:rPr>
+        <w:t>在中国海关出口镜像中，HS6 870840 下共匹配 8 个真实 HS8 子项。2025 年中国出口至印度金额为 185.05 百万美元；2026 年已导出月份合计为 101.96 百万美元。2025—2026 已导出月份中，月度峰值出现在 202606，金额为 23.65 百万美元。</w:t>
+      </w:r>
+      <w:r>
+        <w:rPr>
+          <w:rFonts w:ascii="Microsoft YaHei" w:hAnsi="Microsoft YaHei" w:eastAsia="Microsoft YaHei"/>
+          <w:b w:val="0"/>
+          <w:color w:val="1F4D78"/>
+          <w:sz w:val="16"/>
+          <w:vertAlign w:val="superscript"/>
+        </w:rPr>
+        <w:t>〔6〕</w:t>
       </w:r>
     </w:p>
+    <w:tbl>
+      <w:tblPr>
+        <w:tblStyle w:val="TableGrid"/>
+        <w:jc w:val="center"/>
+        <w:tblLook w:firstColumn="1" w:firstRow="1" w:lastColumn="0" w:lastRow="0" w:noHBand="0" w:noVBand="1" w:val="04A0"/>
+        <w:tblW w:w="9360" w:type="dxa"/>
+        <w:tblInd w:w="120" w:type="dxa"/>
+        <w:tblLayout w:type="fixed"/>
+        <w:tblCellMar>
+          <w:top w:w="80" w:type="dxa"/>
+          <w:start w:w="120" w:type="dxa"/>
+          <w:bottom w:w="80" w:type="dxa"/>
+          <w:end w:w="120" w:type="dxa"/>
+        </w:tblCellMar>
+      </w:tblPr>
+      <w:tblGrid>
+        <w:gridCol w:w="1300"/>
+        <w:gridCol w:w="4260"/>
+        <w:gridCol w:w="1700"/>
+        <w:gridCol w:w="2100"/>
+      </w:tblGrid>
+      <w:tr>
+        <w:trPr>
+          <w:tblHeader w:val="true"/>
+        </w:trPr>
+        <w:tc>
+          <w:tcPr>
+            <w:tcW w:type="dxa" w:w="1300"/>
+            <w:shd w:fill="F2F4F7"/>
+            <w:vAlign w:val="center"/>
+          </w:tcPr>
+          <w:p>
+            <w:pPr>
+              <w:spacing w:after="0"/>
+            </w:pPr>
+            <w:r/>
+            <w:r>
+              <w:rPr>
+                <w:rFonts w:ascii="Microsoft YaHei" w:hAnsi="Microsoft YaHei" w:eastAsia="Microsoft YaHei"/>
+                <w:b/>
+                <w:color w:val="1F4D78"/>
+                <w:sz w:val="19"/>
+              </w:rPr>
+              <w:t>HS8</w:t>
+            </w:r>
+          </w:p>
+        </w:tc>
+        <w:tc>
+          <w:tcPr>
+            <w:tcW w:type="dxa" w:w="4260"/>
+            <w:shd w:fill="F2F4F7"/>
+            <w:vAlign w:val="center"/>
+          </w:tcPr>
+          <w:p>
+            <w:pPr>
+              <w:spacing w:after="0"/>
+            </w:pPr>
+            <w:r/>
+            <w:r>
+              <w:rPr>
+                <w:rFonts w:ascii="Microsoft YaHei" w:hAnsi="Microsoft YaHei" w:eastAsia="Microsoft YaHei"/>
+                <w:b/>
+                <w:color w:val="1F4D78"/>
+                <w:sz w:val="19"/>
+              </w:rPr>
+              <w:t>商品名称</w:t>
+            </w:r>
+          </w:p>
+        </w:tc>
+        <w:tc>
+          <w:tcPr>
+            <w:tcW w:type="dxa" w:w="1700"/>
+            <w:shd w:fill="F2F4F7"/>
+            <w:vAlign w:val="center"/>
+          </w:tcPr>
+          <w:p>
+            <w:pPr>
+              <w:spacing w:after="0"/>
+            </w:pPr>
+            <w:r/>
+            <w:r>
+              <w:rPr>
+                <w:rFonts w:ascii="Microsoft YaHei" w:hAnsi="Microsoft YaHei" w:eastAsia="Microsoft YaHei"/>
+                <w:b/>
+                <w:color w:val="1F4D78"/>
+                <w:sz w:val="19"/>
+              </w:rPr>
+              <w:t>2025出口额</w:t>
+            </w:r>
+          </w:p>
+        </w:tc>
+        <w:tc>
+          <w:tcPr>
+            <w:tcW w:type="dxa" w:w="2100"/>
+            <w:shd w:fill="F2F4F7"/>
+            <w:vAlign w:val="center"/>
+          </w:tcPr>
+          <w:p>
+            <w:pPr>
+              <w:spacing w:after="0"/>
+            </w:pPr>
+            <w:r/>
+            <w:r>
+              <w:rPr>
+                <w:rFonts w:ascii="Microsoft YaHei" w:hAnsi="Microsoft YaHei" w:eastAsia="Microsoft YaHei"/>
+                <w:b/>
+                <w:color w:val="1F4D78"/>
+                <w:sz w:val="19"/>
+              </w:rPr>
+              <w:t>主要贸易方式</w:t>
+            </w:r>
+          </w:p>
+        </w:tc>
+      </w:tr>
+      <w:tr>
+        <w:tc>
+          <w:tcPr>
+            <w:tcW w:type="dxa" w:w="1300"/>
+            <w:vAlign w:val="center"/>
+          </w:tcPr>
+          <w:p>
+            <w:pPr>
+              <w:spacing w:after="0"/>
+            </w:pPr>
+            <w:r/>
+            <w:r>
+              <w:rPr>
+                <w:rFonts w:ascii="Microsoft YaHei" w:hAnsi="Microsoft YaHei" w:eastAsia="Microsoft YaHei"/>
+                <w:b w:val="0"/>
+                <w:color w:val="000000"/>
+                <w:sz w:val="19"/>
+              </w:rPr>
+              <w:t>87084091</w:t>
+            </w:r>
+          </w:p>
+        </w:tc>
+        <w:tc>
+          <w:tcPr>
+            <w:tcW w:type="dxa" w:w="4260"/>
+            <w:vAlign w:val="center"/>
+          </w:tcPr>
+          <w:p>
+            <w:pPr>
+              <w:spacing w:after="0"/>
+            </w:pPr>
+            <w:r/>
+            <w:r>
+              <w:rPr>
+                <w:rFonts w:ascii="Microsoft YaHei" w:hAnsi="Microsoft YaHei" w:eastAsia="Microsoft YaHei"/>
+                <w:b w:val="0"/>
+                <w:color w:val="000000"/>
+                <w:sz w:val="19"/>
+              </w:rPr>
+              <w:t>品目87.03所列车辆用自动换挡变速箱及其零件</w:t>
+            </w:r>
+          </w:p>
+        </w:tc>
+        <w:tc>
+          <w:tcPr>
+            <w:tcW w:type="dxa" w:w="1700"/>
+            <w:vAlign w:val="center"/>
+          </w:tcPr>
+          <w:p>
+            <w:pPr>
+              <w:spacing w:after="0"/>
+            </w:pPr>
+            <w:r/>
+            <w:r>
+              <w:rPr>
+                <w:rFonts w:ascii="Microsoft YaHei" w:hAnsi="Microsoft YaHei" w:eastAsia="Microsoft YaHei"/>
+                <w:b w:val="0"/>
+                <w:color w:val="000000"/>
+                <w:sz w:val="19"/>
+              </w:rPr>
+              <w:t>148.87 百万美元</w:t>
+            </w:r>
+          </w:p>
+        </w:tc>
+        <w:tc>
+          <w:tcPr>
+            <w:tcW w:type="dxa" w:w="2100"/>
+            <w:vAlign w:val="center"/>
+          </w:tcPr>
+          <w:p>
+            <w:pPr>
+              <w:spacing w:after="0"/>
+            </w:pPr>
+            <w:r/>
+            <w:r>
+              <w:rPr>
+                <w:rFonts w:ascii="Microsoft YaHei" w:hAnsi="Microsoft YaHei" w:eastAsia="Microsoft YaHei"/>
+                <w:b w:val="0"/>
+                <w:color w:val="000000"/>
+                <w:sz w:val="19"/>
+              </w:rPr>
+              <w:t>进料加工贸易</w:t>
+            </w:r>
+          </w:p>
+        </w:tc>
+      </w:tr>
+      <w:tr>
+        <w:tc>
+          <w:tcPr>
+            <w:tcW w:type="dxa" w:w="1300"/>
+            <w:vAlign w:val="center"/>
+          </w:tcPr>
+          <w:p>
+            <w:pPr>
+              <w:spacing w:after="0"/>
+            </w:pPr>
+            <w:r/>
+            <w:r>
+              <w:rPr>
+                <w:rFonts w:ascii="Microsoft YaHei" w:hAnsi="Microsoft YaHei" w:eastAsia="Microsoft YaHei"/>
+                <w:b w:val="0"/>
+                <w:color w:val="000000"/>
+                <w:sz w:val="19"/>
+              </w:rPr>
+              <w:t>87084099</w:t>
+            </w:r>
+          </w:p>
+        </w:tc>
+        <w:tc>
+          <w:tcPr>
+            <w:tcW w:type="dxa" w:w="4260"/>
+            <w:vAlign w:val="center"/>
+          </w:tcPr>
+          <w:p>
+            <w:pPr>
+              <w:spacing w:after="0"/>
+            </w:pPr>
+            <w:r/>
+            <w:r>
+              <w:rPr>
+                <w:rFonts w:ascii="Microsoft YaHei" w:hAnsi="Microsoft YaHei" w:eastAsia="Microsoft YaHei"/>
+                <w:b w:val="0"/>
+                <w:color w:val="000000"/>
+                <w:sz w:val="19"/>
+              </w:rPr>
+              <w:t>未列名机动车辆用变速箱及其零件</w:t>
+            </w:r>
+          </w:p>
+        </w:tc>
+        <w:tc>
+          <w:tcPr>
+            <w:tcW w:type="dxa" w:w="1700"/>
+            <w:vAlign w:val="center"/>
+          </w:tcPr>
+          <w:p>
+            <w:pPr>
+              <w:spacing w:after="0"/>
+            </w:pPr>
+            <w:r/>
+            <w:r>
+              <w:rPr>
+                <w:rFonts w:ascii="Microsoft YaHei" w:hAnsi="Microsoft YaHei" w:eastAsia="Microsoft YaHei"/>
+                <w:b w:val="0"/>
+                <w:color w:val="000000"/>
+                <w:sz w:val="19"/>
+              </w:rPr>
+              <w:t>23.06 百万美元</w:t>
+            </w:r>
+          </w:p>
+        </w:tc>
+        <w:tc>
+          <w:tcPr>
+            <w:tcW w:type="dxa" w:w="2100"/>
+            <w:vAlign w:val="center"/>
+          </w:tcPr>
+          <w:p>
+            <w:pPr>
+              <w:spacing w:after="0"/>
+            </w:pPr>
+            <w:r/>
+            <w:r>
+              <w:rPr>
+                <w:rFonts w:ascii="Microsoft YaHei" w:hAnsi="Microsoft YaHei" w:eastAsia="Microsoft YaHei"/>
+                <w:b w:val="0"/>
+                <w:color w:val="000000"/>
+                <w:sz w:val="19"/>
+              </w:rPr>
+              <w:t>一般贸易</w:t>
+            </w:r>
+          </w:p>
+        </w:tc>
+      </w:tr>
+      <w:tr>
+        <w:tc>
+          <w:tcPr>
+            <w:tcW w:type="dxa" w:w="1300"/>
+            <w:vAlign w:val="center"/>
+          </w:tcPr>
+          <w:p>
+            <w:pPr>
+              <w:spacing w:after="0"/>
+            </w:pPr>
+            <w:r/>
+            <w:r>
+              <w:rPr>
+                <w:rFonts w:ascii="Microsoft YaHei" w:hAnsi="Microsoft YaHei" w:eastAsia="Microsoft YaHei"/>
+                <w:b w:val="0"/>
+                <w:color w:val="000000"/>
+                <w:sz w:val="19"/>
+              </w:rPr>
+              <w:t>87084030</w:t>
+            </w:r>
+          </w:p>
+        </w:tc>
+        <w:tc>
+          <w:tcPr>
+            <w:tcW w:type="dxa" w:w="4260"/>
+            <w:vAlign w:val="center"/>
+          </w:tcPr>
+          <w:p>
+            <w:pPr>
+              <w:spacing w:after="0"/>
+            </w:pPr>
+            <w:r/>
+            <w:r>
+              <w:rPr>
+                <w:rFonts w:ascii="Microsoft YaHei" w:hAnsi="Microsoft YaHei" w:eastAsia="Microsoft YaHei"/>
+                <w:b w:val="0"/>
+                <w:color w:val="000000"/>
+                <w:sz w:val="19"/>
+              </w:rPr>
+              <w:t>非公路用自卸车用变速箱及其零件</w:t>
+            </w:r>
+          </w:p>
+        </w:tc>
+        <w:tc>
+          <w:tcPr>
+            <w:tcW w:type="dxa" w:w="1700"/>
+            <w:vAlign w:val="center"/>
+          </w:tcPr>
+          <w:p>
+            <w:pPr>
+              <w:spacing w:after="0"/>
+            </w:pPr>
+            <w:r/>
+            <w:r>
+              <w:rPr>
+                <w:rFonts w:ascii="Microsoft YaHei" w:hAnsi="Microsoft YaHei" w:eastAsia="Microsoft YaHei"/>
+                <w:b w:val="0"/>
+                <w:color w:val="000000"/>
+                <w:sz w:val="19"/>
+              </w:rPr>
+              <w:t>9.23 百万美元</w:t>
+            </w:r>
+          </w:p>
+        </w:tc>
+        <w:tc>
+          <w:tcPr>
+            <w:tcW w:type="dxa" w:w="2100"/>
+            <w:vAlign w:val="center"/>
+          </w:tcPr>
+          <w:p>
+            <w:pPr>
+              <w:spacing w:after="0"/>
+            </w:pPr>
+            <w:r/>
+            <w:r>
+              <w:rPr>
+                <w:rFonts w:ascii="Microsoft YaHei" w:hAnsi="Microsoft YaHei" w:eastAsia="Microsoft YaHei"/>
+                <w:b w:val="0"/>
+                <w:color w:val="000000"/>
+                <w:sz w:val="19"/>
+              </w:rPr>
+              <w:t>一般贸易</w:t>
+            </w:r>
+          </w:p>
+        </w:tc>
+      </w:tr>
+      <w:tr>
+        <w:tc>
+          <w:tcPr>
+            <w:tcW w:type="dxa" w:w="1300"/>
+            <w:vAlign w:val="center"/>
+          </w:tcPr>
+          <w:p>
+            <w:pPr>
+              <w:spacing w:after="0"/>
+            </w:pPr>
+            <w:r/>
+            <w:r>
+              <w:rPr>
+                <w:rFonts w:ascii="Microsoft YaHei" w:hAnsi="Microsoft YaHei" w:eastAsia="Microsoft YaHei"/>
+                <w:b w:val="0"/>
+                <w:color w:val="000000"/>
+                <w:sz w:val="19"/>
+              </w:rPr>
+              <w:t>87084010</w:t>
+            </w:r>
+          </w:p>
+        </w:tc>
+        <w:tc>
+          <w:tcPr>
+            <w:tcW w:type="dxa" w:w="4260"/>
+            <w:vAlign w:val="center"/>
+          </w:tcPr>
+          <w:p>
+            <w:pPr>
+              <w:spacing w:after="0"/>
+            </w:pPr>
+            <w:r/>
+            <w:r>
+              <w:rPr>
+                <w:rFonts w:ascii="Microsoft YaHei" w:hAnsi="Microsoft YaHei" w:eastAsia="Microsoft YaHei"/>
+                <w:b w:val="0"/>
+                <w:color w:val="000000"/>
+                <w:sz w:val="19"/>
+              </w:rPr>
+              <w:t>牵引车、拖拉机用变速箱及其零件</w:t>
+            </w:r>
+          </w:p>
+        </w:tc>
+        <w:tc>
+          <w:tcPr>
+            <w:tcW w:type="dxa" w:w="1700"/>
+            <w:vAlign w:val="center"/>
+          </w:tcPr>
+          <w:p>
+            <w:pPr>
+              <w:spacing w:after="0"/>
+            </w:pPr>
+            <w:r/>
+            <w:r>
+              <w:rPr>
+                <w:rFonts w:ascii="Microsoft YaHei" w:hAnsi="Microsoft YaHei" w:eastAsia="Microsoft YaHei"/>
+                <w:b w:val="0"/>
+                <w:color w:val="000000"/>
+                <w:sz w:val="19"/>
+              </w:rPr>
+              <w:t>2.74 百万美元</w:t>
+            </w:r>
+          </w:p>
+        </w:tc>
+        <w:tc>
+          <w:tcPr>
+            <w:tcW w:type="dxa" w:w="2100"/>
+            <w:vAlign w:val="center"/>
+          </w:tcPr>
+          <w:p>
+            <w:pPr>
+              <w:spacing w:after="0"/>
+            </w:pPr>
+            <w:r/>
+            <w:r>
+              <w:rPr>
+                <w:rFonts w:ascii="Microsoft YaHei" w:hAnsi="Microsoft YaHei" w:eastAsia="Microsoft YaHei"/>
+                <w:b w:val="0"/>
+                <w:color w:val="000000"/>
+                <w:sz w:val="19"/>
+              </w:rPr>
+              <w:t>一般贸易</w:t>
+            </w:r>
+          </w:p>
+        </w:tc>
+      </w:tr>
+      <w:tr>
+        <w:tc>
+          <w:tcPr>
+            <w:tcW w:type="dxa" w:w="1300"/>
+            <w:vAlign w:val="center"/>
+          </w:tcPr>
+          <w:p>
+            <w:pPr>
+              <w:spacing w:after="0"/>
+            </w:pPr>
+            <w:r/>
+            <w:r>
+              <w:rPr>
+                <w:rFonts w:ascii="Microsoft YaHei" w:hAnsi="Microsoft YaHei" w:eastAsia="Microsoft YaHei"/>
+                <w:b w:val="0"/>
+                <w:color w:val="000000"/>
+                <w:sz w:val="19"/>
+              </w:rPr>
+              <w:t>87084020</w:t>
+            </w:r>
+          </w:p>
+        </w:tc>
+        <w:tc>
+          <w:tcPr>
+            <w:tcW w:type="dxa" w:w="4260"/>
+            <w:vAlign w:val="center"/>
+          </w:tcPr>
+          <w:p>
+            <w:pPr>
+              <w:spacing w:after="0"/>
+            </w:pPr>
+            <w:r/>
+            <w:r>
+              <w:rPr>
+                <w:rFonts w:ascii="Microsoft YaHei" w:hAnsi="Microsoft YaHei" w:eastAsia="Microsoft YaHei"/>
+                <w:b w:val="0"/>
+                <w:color w:val="000000"/>
+                <w:sz w:val="19"/>
+              </w:rPr>
+              <w:t>≥30座的机动客车用变速箱及其零件</w:t>
+            </w:r>
+          </w:p>
+        </w:tc>
+        <w:tc>
+          <w:tcPr>
+            <w:tcW w:type="dxa" w:w="1700"/>
+            <w:vAlign w:val="center"/>
+          </w:tcPr>
+          <w:p>
+            <w:pPr>
+              <w:spacing w:after="0"/>
+            </w:pPr>
+            <w:r/>
+            <w:r>
+              <w:rPr>
+                <w:rFonts w:ascii="Microsoft YaHei" w:hAnsi="Microsoft YaHei" w:eastAsia="Microsoft YaHei"/>
+                <w:b w:val="0"/>
+                <w:color w:val="000000"/>
+                <w:sz w:val="19"/>
+              </w:rPr>
+              <w:t>416,466 美元</w:t>
+            </w:r>
+          </w:p>
+        </w:tc>
+        <w:tc>
+          <w:tcPr>
+            <w:tcW w:type="dxa" w:w="2100"/>
+            <w:vAlign w:val="center"/>
+          </w:tcPr>
+          <w:p>
+            <w:pPr>
+              <w:spacing w:after="0"/>
+            </w:pPr>
+            <w:r/>
+            <w:r>
+              <w:rPr>
+                <w:rFonts w:ascii="Microsoft YaHei" w:hAnsi="Microsoft YaHei" w:eastAsia="Microsoft YaHei"/>
+                <w:b w:val="0"/>
+                <w:color w:val="000000"/>
+                <w:sz w:val="19"/>
+              </w:rPr>
+              <w:t>一般贸易</w:t>
+            </w:r>
+          </w:p>
+        </w:tc>
+      </w:tr>
+      <w:tr>
+        <w:tc>
+          <w:tcPr>
+            <w:tcW w:type="dxa" w:w="1300"/>
+            <w:vAlign w:val="center"/>
+          </w:tcPr>
+          <w:p>
+            <w:pPr>
+              <w:spacing w:after="0"/>
+            </w:pPr>
+            <w:r/>
+            <w:r>
+              <w:rPr>
+                <w:rFonts w:ascii="Microsoft YaHei" w:hAnsi="Microsoft YaHei" w:eastAsia="Microsoft YaHei"/>
+                <w:b w:val="0"/>
+                <w:color w:val="000000"/>
+                <w:sz w:val="19"/>
+              </w:rPr>
+              <w:t>87084060</w:t>
+            </w:r>
+          </w:p>
+        </w:tc>
+        <w:tc>
+          <w:tcPr>
+            <w:tcW w:type="dxa" w:w="4260"/>
+            <w:vAlign w:val="center"/>
+          </w:tcPr>
+          <w:p>
+            <w:pPr>
+              <w:spacing w:after="0"/>
+            </w:pPr>
+            <w:r/>
+            <w:r>
+              <w:rPr>
+                <w:rFonts w:ascii="Microsoft YaHei" w:hAnsi="Microsoft YaHei" w:eastAsia="Microsoft YaHei"/>
+                <w:b w:val="0"/>
+                <w:color w:val="000000"/>
+                <w:sz w:val="19"/>
+              </w:rPr>
+              <w:t>品目87.05所列车辆用变速箱及其零件</w:t>
+            </w:r>
+          </w:p>
+        </w:tc>
+        <w:tc>
+          <w:tcPr>
+            <w:tcW w:type="dxa" w:w="1700"/>
+            <w:vAlign w:val="center"/>
+          </w:tcPr>
+          <w:p>
+            <w:pPr>
+              <w:spacing w:after="0"/>
+            </w:pPr>
+            <w:r/>
+            <w:r>
+              <w:rPr>
+                <w:rFonts w:ascii="Microsoft YaHei" w:hAnsi="Microsoft YaHei" w:eastAsia="Microsoft YaHei"/>
+                <w:b w:val="0"/>
+                <w:color w:val="000000"/>
+                <w:sz w:val="19"/>
+              </w:rPr>
+              <w:t>377,423 美元</w:t>
+            </w:r>
+          </w:p>
+        </w:tc>
+        <w:tc>
+          <w:tcPr>
+            <w:tcW w:type="dxa" w:w="2100"/>
+            <w:vAlign w:val="center"/>
+          </w:tcPr>
+          <w:p>
+            <w:pPr>
+              <w:spacing w:after="0"/>
+            </w:pPr>
+            <w:r/>
+            <w:r>
+              <w:rPr>
+                <w:rFonts w:ascii="Microsoft YaHei" w:hAnsi="Microsoft YaHei" w:eastAsia="Microsoft YaHei"/>
+                <w:b w:val="0"/>
+                <w:color w:val="000000"/>
+                <w:sz w:val="19"/>
+              </w:rPr>
+              <w:t>一般贸易</w:t>
+            </w:r>
+          </w:p>
+        </w:tc>
+      </w:tr>
+      <w:tr>
+        <w:tc>
+          <w:tcPr>
+            <w:tcW w:type="dxa" w:w="1300"/>
+            <w:vAlign w:val="center"/>
+          </w:tcPr>
+          <w:p>
+            <w:pPr>
+              <w:spacing w:after="0"/>
+            </w:pPr>
+            <w:r/>
+            <w:r>
+              <w:rPr>
+                <w:rFonts w:ascii="Microsoft YaHei" w:hAnsi="Microsoft YaHei" w:eastAsia="Microsoft YaHei"/>
+                <w:b w:val="0"/>
+                <w:color w:val="000000"/>
+                <w:sz w:val="19"/>
+              </w:rPr>
+              <w:t>87084050</w:t>
+            </w:r>
+          </w:p>
+        </w:tc>
+        <w:tc>
+          <w:tcPr>
+            <w:tcW w:type="dxa" w:w="4260"/>
+            <w:vAlign w:val="center"/>
+          </w:tcPr>
+          <w:p>
+            <w:pPr>
+              <w:spacing w:after="0"/>
+            </w:pPr>
+            <w:r/>
+            <w:r>
+              <w:rPr>
+                <w:rFonts w:ascii="Microsoft YaHei" w:hAnsi="Microsoft YaHei" w:eastAsia="Microsoft YaHei"/>
+                <w:b w:val="0"/>
+                <w:color w:val="000000"/>
+                <w:sz w:val="19"/>
+              </w:rPr>
+              <w:t>重型柴油货车用变速箱及其零件</w:t>
+            </w:r>
+          </w:p>
+        </w:tc>
+        <w:tc>
+          <w:tcPr>
+            <w:tcW w:type="dxa" w:w="1700"/>
+            <w:vAlign w:val="center"/>
+          </w:tcPr>
+          <w:p>
+            <w:pPr>
+              <w:spacing w:after="0"/>
+            </w:pPr>
+            <w:r/>
+            <w:r>
+              <w:rPr>
+                <w:rFonts w:ascii="Microsoft YaHei" w:hAnsi="Microsoft YaHei" w:eastAsia="Microsoft YaHei"/>
+                <w:b w:val="0"/>
+                <w:color w:val="000000"/>
+                <w:sz w:val="19"/>
+              </w:rPr>
+              <w:t>350,181 美元</w:t>
+            </w:r>
+          </w:p>
+        </w:tc>
+        <w:tc>
+          <w:tcPr>
+            <w:tcW w:type="dxa" w:w="2100"/>
+            <w:vAlign w:val="center"/>
+          </w:tcPr>
+          <w:p>
+            <w:pPr>
+              <w:spacing w:after="0"/>
+            </w:pPr>
+            <w:r/>
+            <w:r>
+              <w:rPr>
+                <w:rFonts w:ascii="Microsoft YaHei" w:hAnsi="Microsoft YaHei" w:eastAsia="Microsoft YaHei"/>
+                <w:b w:val="0"/>
+                <w:color w:val="000000"/>
+                <w:sz w:val="19"/>
+              </w:rPr>
+              <w:t>一般贸易</w:t>
+            </w:r>
+          </w:p>
+        </w:tc>
+      </w:tr>
+      <w:tr>
+        <w:tc>
+          <w:tcPr>
+            <w:tcW w:type="dxa" w:w="1300"/>
+            <w:vAlign w:val="center"/>
+          </w:tcPr>
+          <w:p>
+            <w:pPr>
+              <w:spacing w:after="0"/>
+            </w:pPr>
+            <w:r/>
+            <w:r>
+              <w:rPr>
+                <w:rFonts w:ascii="Microsoft YaHei" w:hAnsi="Microsoft YaHei" w:eastAsia="Microsoft YaHei"/>
+                <w:b w:val="0"/>
+                <w:color w:val="000000"/>
+                <w:sz w:val="19"/>
+              </w:rPr>
+              <w:t>87084040</w:t>
+            </w:r>
+          </w:p>
+        </w:tc>
+        <w:tc>
+          <w:tcPr>
+            <w:tcW w:type="dxa" w:w="4260"/>
+            <w:vAlign w:val="center"/>
+          </w:tcPr>
+          <w:p>
+            <w:pPr>
+              <w:spacing w:after="0"/>
+            </w:pPr>
+            <w:r/>
+            <w:r>
+              <w:rPr>
+                <w:rFonts w:ascii="Microsoft YaHei" w:hAnsi="Microsoft YaHei" w:eastAsia="Microsoft YaHei"/>
+                <w:b w:val="0"/>
+                <w:color w:val="000000"/>
+                <w:sz w:val="19"/>
+              </w:rPr>
+              <w:t>轻型柴油及汽油货车用变速箱及其零件</w:t>
+            </w:r>
+          </w:p>
+        </w:tc>
+        <w:tc>
+          <w:tcPr>
+            <w:tcW w:type="dxa" w:w="1700"/>
+            <w:vAlign w:val="center"/>
+          </w:tcPr>
+          <w:p>
+            <w:pPr>
+              <w:spacing w:after="0"/>
+            </w:pPr>
+            <w:r/>
+            <w:r>
+              <w:rPr>
+                <w:rFonts w:ascii="Microsoft YaHei" w:hAnsi="Microsoft YaHei" w:eastAsia="Microsoft YaHei"/>
+                <w:b w:val="0"/>
+                <w:color w:val="000000"/>
+                <w:sz w:val="19"/>
+              </w:rPr>
+              <w:t>8,702 美元</w:t>
+            </w:r>
+          </w:p>
+        </w:tc>
+        <w:tc>
+          <w:tcPr>
+            <w:tcW w:type="dxa" w:w="2100"/>
+            <w:vAlign w:val="center"/>
+          </w:tcPr>
+          <w:p>
+            <w:pPr>
+              <w:spacing w:after="0"/>
+            </w:pPr>
+            <w:r/>
+            <w:r>
+              <w:rPr>
+                <w:rFonts w:ascii="Microsoft YaHei" w:hAnsi="Microsoft YaHei" w:eastAsia="Microsoft YaHei"/>
+                <w:b w:val="0"/>
+                <w:color w:val="000000"/>
+                <w:sz w:val="19"/>
+              </w:rPr>
+              <w:t>一般贸易</w:t>
+            </w:r>
+          </w:p>
+        </w:tc>
+      </w:tr>
+    </w:tbl>
     <w:p>
+      <w:pPr>
+        <w:spacing w:after="120"/>
+      </w:pPr>
       <w:r>
-        <w:t>其他供应来源按同一 HS6、同一报告国、同一年度的进口金额排序。它们说明采购来源结构，不等于已经具备同等产能、认证、交付周期或价格条件。</w:t>
-      </w:r>
-    </w:p>
-    <w:p>
-      <w:r>
-        <w:t>公开贸易数据能够识别来源集中度，但不足以替代企业级 BOM、合同、发票、原产地证书和物流单证。对受控物项还必须核对技术参数、最终用户和最终用途。</w:t>
+        <w:rPr>
+          <w:rFonts w:ascii="Microsoft YaHei" w:hAnsi="Microsoft YaHei" w:eastAsia="Microsoft YaHei"/>
+          <w:b w:val="0"/>
+          <w:color w:val="666666"/>
+          <w:sz w:val="18"/>
+        </w:rPr>
+        <w:t>表注：如某 HS6 下超过 10 个 HS8，表中列示金额靠前的主要子项；完整明细以网页交互卡片和原始 CSV 为准。</w:t>
       </w:r>
     </w:p>
     <w:p>
@@ -409,12 +1330,17 @@
         <w:pStyle w:val="Heading1"/>
       </w:pPr>
       <w:r>
-        <w:t>四、第三国路径与判读边界</w:t>
+        <w:t>五、第三国路径与判读边界</w:t>
       </w:r>
     </w:p>
     <w:p>
       <w:r>
-        <w:t>当前未取得与 HS6 870840 完全同口径且能够对应同一批货物的逐段单证闭环。即使中国至一个或多个中转国、再至印度的双边金额在同一时期同步上升，也只能作为核验线索；必须再用提单、原产地证书、发票、加工记录或公开查发案例确认。</w:t>
+        <w:t>HS 8708 覆盖电驱、底盘、车身与安全系统等大量子类，供应商国别与零件原产地必须分开判断。</w:t>
+      </w:r>
+    </w:p>
+    <w:p>
+      <w:r>
+        <w:t>对 HS 870840 而言，第三国路径至少需要同时满足四类证据：第一，中国至中转节点存在同口径商品出口；第二，中转节点至印度存在同口径商品出口或印度进口；第三，金额、月份、数量单位和商品描述具有可比性；第四，原产地证书、提单、发票、加工记录或公开查发案例能够解释同一货物或同一供应网络。</w:t>
       </w:r>
     </w:p>
     <w:p>
@@ -422,12 +1348,32 @@
         <w:pStyle w:val="Heading1"/>
       </w:pPr>
       <w:r>
-        <w:t>五、结论</w:t>
+        <w:t>六、分析</w:t>
       </w:r>
     </w:p>
     <w:p>
       <w:r>
-        <w:t>机动车变速箱及其零件对华进口来源集中度较低，应保持常态监测。本结论准确度标注为“高概率”，仅适用于 HS6 870840 的 2025 年进口来源结构；后续若取得中国海关 HS8、企业料号和业务单证，应在不改变国际 HS6 可比口径的前提下进一步下钻。</w:t>
+        <w:t>总体依赖度不高，但电驱、电控和特定电子零件可能存在显著的中国成分暴露。</w:t>
+      </w:r>
+    </w:p>
+    <w:p>
+      <w:r>
+        <w:t>印度本地装配与跨国车企供应体系会产生多国采购，不应将区域分工自动视为转口。</w:t>
+      </w:r>
+    </w:p>
+    <w:p>
+      <w:r>
+        <w:t>机动车变速箱及其零件的公开统计占比处于较低区间。低占比并不意味着没有供应链风险，但风险更可能集中在少数企业、少数高端型号或受控参数，而不是全国进口来源结构。后续核验应以企业订单、型号和用途为核心，而不是扩大为行业性依赖判断。</w:t>
+      </w:r>
+    </w:p>
+    <w:p>
+      <w:r>
+        <w:t>替代供应方面，2025 年除中国外的主要来源包括：日本、韩国、德国、美国、泰国。这些来源国可以作为供应分散化的第一批观察对象，但其是否具备现实替代能力，仍需进一步比较产品等级、报价条款、交期、认证记录、历史交付稳定性和售后能力。对于工程设备、电子电力和医药化工类商品，还需要特别注意整机、零部件、材料和中间体之间的税号差异。</w:t>
+      </w:r>
+    </w:p>
+    <w:p>
+      <w:r>
+        <w:t>从中国出口管制策略研究角度看，HS 870840 只能作为筛查入口，不能直接替代受控物项判定。真正需要落到三个层级：第一，税号与商品描述是否锁定到具体物项；第二，技术参数、性能指标、材料形态或最终用途是否触及管制清单；第三，交易链条中的最终用户、最终用途、发票国、装运国和原产国是否一致。因此，本报告将贸易金额用于识别优先级，将单证和技术参数留作后续核验重点。</w:t>
       </w:r>
     </w:p>
     <w:p>
@@ -435,7 +1381,25 @@
         <w:pStyle w:val="Heading1"/>
       </w:pPr>
       <w:r>
-        <w:t>六、后续监测重点</w:t>
+        <w:t>七、结论</w:t>
+      </w:r>
+    </w:p>
+    <w:p>
+      <w:r>
+        <w:t>该品类的风险集中在关键子系统而非 HS4 总量。建议按车型、一级供应商和 BOM 层级开展原产地审计。</w:t>
+      </w:r>
+    </w:p>
+    <w:p>
+      <w:r>
+        <w:t>准确度标注：高概率。结论主要基于公开统计与审慎边界表述。</w:t>
+      </w:r>
+    </w:p>
+    <w:p>
+      <w:pPr>
+        <w:pStyle w:val="Heading1"/>
+      </w:pPr>
+      <w:r>
+        <w:t>八、后续监测重点</w:t>
       </w:r>
     </w:p>
     <w:p>
@@ -448,7 +1412,7 @@
           <w:rFonts w:ascii="Microsoft YaHei" w:hAnsi="Microsoft YaHei" w:eastAsia="Microsoft YaHei"/>
           <w:sz w:val="21"/>
         </w:rPr>
-        <w:t>HS6 870840 的月度进口金额、数量和对华来源占比</w:t>
+        <w:t>电驱、电控、底盘和安全系统拆分</w:t>
       </w:r>
     </w:p>
     <w:p>
@@ -461,7 +1425,7 @@
           <w:rFonts w:ascii="Microsoft YaHei" w:hAnsi="Microsoft YaHei" w:eastAsia="Microsoft YaHei"/>
           <w:sz w:val="21"/>
         </w:rPr>
-        <w:t>中国海关 HS8、企业料号与印度本国八位税号映射</w:t>
+        <w:t>一级供应商及 BOM 原产地</w:t>
       </w:r>
     </w:p>
     <w:p>
@@ -474,20 +1438,7 @@
           <w:rFonts w:ascii="Microsoft YaHei" w:hAnsi="Microsoft YaHei" w:eastAsia="Microsoft YaHei"/>
           <w:sz w:val="21"/>
         </w:rPr>
-        <w:t>原产国、装运国、发票国、提单路径与实际加工工序</w:t>
-      </w:r>
-    </w:p>
-    <w:p>
-      <w:pPr>
-        <w:pStyle w:val="ListBullet"/>
-        <w:spacing w:after="80"/>
-      </w:pPr>
-      <w:r>
-        <w:rPr>
-          <w:rFonts w:ascii="Microsoft YaHei" w:hAnsi="Microsoft YaHei" w:eastAsia="Microsoft YaHei"/>
-          <w:sz w:val="21"/>
-        </w:rPr>
-        <w:t>出口许可证、技术参数、最终用户和最终用途变化</w:t>
+        <w:t>区域装配与 FTA 原产地合规</w:t>
       </w:r>
     </w:p>
     <w:p>
@@ -495,46 +1446,259 @@
         <w:pStyle w:val="Heading1"/>
       </w:pPr>
       <w:r>
-        <w:t>七、来源</w:t>
+        <w:t>脚注与数据来源</w:t>
       </w:r>
     </w:p>
     <w:p>
       <w:pPr>
-        <w:pStyle w:val="ListBullet"/>
-        <w:spacing w:after="80"/>
+        <w:spacing w:after="60"/>
       </w:pPr>
       <w:r>
         <w:rPr>
           <w:rFonts w:ascii="Microsoft YaHei" w:hAnsi="Microsoft YaHei" w:eastAsia="Microsoft YaHei"/>
-          <w:sz w:val="21"/>
+          <w:b/>
+          <w:color w:val="1F4D78"/>
+          <w:sz w:val="18"/>
         </w:rPr>
-        <w:t>UN Comtrade 公共 API：reporterCode=699（印度）、partnerCode=0/156、flowCode=M、cmdCode=870840、period=2025；访问 2026-07-23。</w:t>
+        <w:t>〔1〕</w:t>
+      </w:r>
+      <w:r>
+        <w:rPr>
+          <w:rFonts w:ascii="Microsoft YaHei" w:hAnsi="Microsoft YaHei" w:eastAsia="Microsoft YaHei"/>
+          <w:sz w:val="18"/>
+        </w:rPr>
+        <w:t>UN Comtrade 公共 API，报告国印度（reporterCode=699），贸易伙伴中国/世界（partnerCode=156/0），flowCode=M，cmdCode=870840，period=2025；访问日期 2026-07-24。</w:t>
       </w:r>
     </w:p>
     <w:p>
       <w:pPr>
-        <w:pStyle w:val="ListBullet"/>
-        <w:spacing w:after="80"/>
+        <w:spacing w:after="60"/>
       </w:pPr>
       <w:r>
         <w:rPr>
           <w:rFonts w:ascii="Microsoft YaHei" w:hAnsi="Microsoft YaHei" w:eastAsia="Microsoft YaHei"/>
-          <w:sz w:val="21"/>
+          <w:b/>
+          <w:color w:val="1F4D78"/>
+          <w:sz w:val="18"/>
+        </w:rPr>
+        <w:t>〔2〕</w:t>
+      </w:r>
+      <w:r>
+        <w:rPr>
+          <w:rFonts w:ascii="Microsoft YaHei" w:hAnsi="Microsoft YaHei" w:eastAsia="Microsoft YaHei"/>
+          <w:sz w:val="18"/>
+        </w:rPr>
+        <w:t>UN Comtrade 公共 API，报告国印度（reporterCode=699），贸易伙伴中国/世界（partnerCode=156/0），flowCode=M，cmdCode=870840，period=2025；访问日期 2026-07-24。</w:t>
+      </w:r>
+    </w:p>
+    <w:p>
+      <w:pPr>
+        <w:spacing w:after="60"/>
+      </w:pPr>
+      <w:r>
+        <w:rPr>
+          <w:rFonts w:ascii="Microsoft YaHei" w:hAnsi="Microsoft YaHei" w:eastAsia="Microsoft YaHei"/>
+          <w:b/>
+          <w:color w:val="1F4D78"/>
+          <w:sz w:val="18"/>
+        </w:rPr>
+        <w:t>〔3〕</w:t>
+      </w:r>
+      <w:r>
+        <w:rPr>
+          <w:rFonts w:ascii="Microsoft YaHei" w:hAnsi="Microsoft YaHei" w:eastAsia="Microsoft YaHei"/>
+          <w:sz w:val="18"/>
+        </w:rPr>
+        <w:t>UN Comtrade 公共 API，报告国印度（reporterCode=699），贸易伙伴中国/世界（partnerCode=156/0），flowCode=M，cmdCode=870840，period=2025；访问日期 2026-07-24。</w:t>
+      </w:r>
+    </w:p>
+    <w:p>
+      <w:pPr>
+        <w:spacing w:after="60"/>
+      </w:pPr>
+      <w:r>
+        <w:rPr>
+          <w:rFonts w:ascii="Microsoft YaHei" w:hAnsi="Microsoft YaHei" w:eastAsia="Microsoft YaHei"/>
+          <w:b/>
+          <w:color w:val="1F4D78"/>
+          <w:sz w:val="18"/>
+        </w:rPr>
+        <w:t>〔4〕</w:t>
+      </w:r>
+      <w:r>
+        <w:rPr>
+          <w:rFonts w:ascii="Microsoft YaHei" w:hAnsi="Microsoft YaHei" w:eastAsia="Microsoft YaHei"/>
+          <w:sz w:val="18"/>
+        </w:rPr>
+        <w:t>印度议会答复 4023/2025</w:t>
+      </w:r>
+    </w:p>
+    <w:p>
+      <w:pPr>
+        <w:spacing w:after="60"/>
+      </w:pPr>
+      <w:r>
+        <w:rPr>
+          <w:rFonts w:ascii="Microsoft YaHei" w:hAnsi="Microsoft YaHei" w:eastAsia="Microsoft YaHei"/>
+          <w:b/>
+          <w:color w:val="1F4D78"/>
+          <w:sz w:val="18"/>
+        </w:rPr>
+        <w:t>〔5〕</w:t>
+      </w:r>
+      <w:r>
+        <w:rPr>
+          <w:rFonts w:ascii="Microsoft YaHei" w:hAnsi="Microsoft YaHei" w:eastAsia="Microsoft YaHei"/>
+          <w:sz w:val="18"/>
+        </w:rPr>
+        <w:t>印度议会答复 4023/2025</w:t>
+      </w:r>
+    </w:p>
+    <w:p>
+      <w:pPr>
+        <w:spacing w:after="60"/>
+      </w:pPr>
+      <w:r>
+        <w:rPr>
+          <w:rFonts w:ascii="Microsoft YaHei" w:hAnsi="Microsoft YaHei" w:eastAsia="Microsoft YaHei"/>
+          <w:b/>
+          <w:color w:val="1F4D78"/>
+          <w:sz w:val="18"/>
+        </w:rPr>
+        <w:t>〔6〕</w:t>
+      </w:r>
+      <w:r>
+        <w:rPr>
+          <w:rFonts w:ascii="Microsoft YaHei" w:hAnsi="Microsoft YaHei" w:eastAsia="Microsoft YaHei"/>
+          <w:sz w:val="18"/>
+        </w:rPr>
+        <w:t>海关总署统计网，中国出口至印度，贸易伙伴编码 111，HS6 870840 下真实 HS8 明细，来源文件 数据导出.csv、数据导出 (1).csv，访问日期 2026-07-24。</w:t>
+      </w:r>
+    </w:p>
+    <w:p>
+      <w:pPr>
+        <w:spacing w:after="60"/>
+      </w:pPr>
+      <w:r>
+        <w:rPr>
+          <w:rFonts w:ascii="Microsoft YaHei" w:hAnsi="Microsoft YaHei" w:eastAsia="Microsoft YaHei"/>
+          <w:b/>
+          <w:color w:val="1F4D78"/>
+          <w:sz w:val="18"/>
+        </w:rPr>
+        <w:t>〔7〕</w:t>
+      </w:r>
+      <w:r>
+        <w:rPr>
+          <w:rFonts w:ascii="Microsoft YaHei" w:hAnsi="Microsoft YaHei" w:eastAsia="Microsoft YaHei"/>
+          <w:sz w:val="18"/>
+        </w:rPr>
+        <w:t>研究报告第 8—9 页：HS 8708 分析</w:t>
+      </w:r>
+    </w:p>
+    <w:p>
+      <w:pPr>
+        <w:spacing w:after="60"/>
+      </w:pPr>
+      <w:r>
+        <w:rPr>
+          <w:rFonts w:ascii="Microsoft YaHei" w:hAnsi="Microsoft YaHei" w:eastAsia="Microsoft YaHei"/>
+          <w:b/>
+          <w:color w:val="1F4D78"/>
+          <w:sz w:val="18"/>
+        </w:rPr>
+        <w:t>〔8〕</w:t>
+      </w:r>
+      <w:r>
+        <w:rPr>
+          <w:rFonts w:ascii="Microsoft YaHei" w:hAnsi="Microsoft YaHei" w:eastAsia="Microsoft YaHei"/>
+          <w:sz w:val="18"/>
+        </w:rPr>
+        <w:t>印度议会答复 4023/2025</w:t>
+      </w:r>
+    </w:p>
+    <w:p>
+      <w:pPr>
+        <w:spacing w:after="60"/>
+      </w:pPr>
+      <w:r>
+        <w:rPr>
+          <w:rFonts w:ascii="Microsoft YaHei" w:hAnsi="Microsoft YaHei" w:eastAsia="Microsoft YaHei"/>
+          <w:b/>
+          <w:color w:val="1F4D78"/>
+          <w:sz w:val="18"/>
+        </w:rPr>
+        <w:t>〔9〕</w:t>
+      </w:r>
+      <w:r>
+        <w:rPr>
+          <w:rFonts w:ascii="Microsoft YaHei" w:hAnsi="Microsoft YaHei" w:eastAsia="Microsoft YaHei"/>
+          <w:sz w:val="18"/>
+        </w:rPr>
+        <w:t>UN Comtrade 公共 API，报告国印度（reporterCode=699），贸易伙伴中国/世界（partnerCode=156/0），flowCode=M，cmdCode=870840，period=2025；访问日期 2026-07-24。</w:t>
+      </w:r>
+    </w:p>
+    <w:p>
+      <w:pPr>
+        <w:spacing w:after="60"/>
+      </w:pPr>
+      <w:r>
+        <w:rPr>
+          <w:rFonts w:ascii="Microsoft YaHei" w:hAnsi="Microsoft YaHei" w:eastAsia="Microsoft YaHei"/>
+          <w:b/>
+          <w:color w:val="1F4D78"/>
+          <w:sz w:val="18"/>
+        </w:rPr>
+        <w:t>〔10〕</w:t>
+      </w:r>
+      <w:r>
+        <w:rPr>
+          <w:rFonts w:ascii="Microsoft YaHei" w:hAnsi="Microsoft YaHei" w:eastAsia="Microsoft YaHei"/>
+          <w:sz w:val="18"/>
         </w:rPr>
         <w:t>印度 DGCI&amp;S TradeStat：月度贸易数据库与编码调整说明。</w:t>
       </w:r>
     </w:p>
     <w:p>
       <w:pPr>
-        <w:pStyle w:val="ListBullet"/>
-        <w:spacing w:after="80"/>
+        <w:spacing w:after="60"/>
       </w:pPr>
       <w:r>
         <w:rPr>
           <w:rFonts w:ascii="Microsoft YaHei" w:hAnsi="Microsoft YaHei" w:eastAsia="Microsoft YaHei"/>
-          <w:sz w:val="21"/>
+          <w:b/>
+          <w:color w:val="1F4D78"/>
+          <w:sz w:val="18"/>
+        </w:rPr>
+        <w:t>〔11〕</w:t>
+      </w:r>
+      <w:r>
+        <w:rPr>
+          <w:rFonts w:ascii="Microsoft YaHei" w:hAnsi="Microsoft YaHei" w:eastAsia="Microsoft YaHei"/>
+          <w:sz w:val="18"/>
         </w:rPr>
         <w:t>中国商务部、海关总署及中国出口管制信息网：现行两用物项清单、公告与许可证管理目录。</w:t>
+      </w:r>
+    </w:p>
+    <w:p>
+      <w:pPr>
+        <w:spacing w:after="60"/>
+      </w:pPr>
+      <w:r>
+        <w:rPr>
+          <w:rFonts w:ascii="Microsoft YaHei" w:hAnsi="Microsoft YaHei" w:eastAsia="Microsoft YaHei"/>
+          <w:b/>
+          <w:color w:val="1F4D78"/>
+          <w:sz w:val="18"/>
+        </w:rPr>
+        <w:t>〔12〕</w:t>
+      </w:r>
+      <w:r>
+        <w:rPr>
+          <w:rFonts w:ascii="Microsoft YaHei" w:hAnsi="Microsoft YaHei" w:eastAsia="Microsoft YaHei"/>
+          <w:sz w:val="18"/>
+        </w:rPr>
+        <w:t>海关总署统计网，中国出口至印度，贸易伙伴编码 111，HS6 870840 下真实 HS8 明细，来源文件 数据导出.csv、数据导出 (1).csv，访问日期 2026-07-24。</w:t>
       </w:r>
     </w:p>
     <w:p>
@@ -568,7 +1732,7 @@
         <w:color w:val="666666"/>
         <w:sz w:val="18"/>
       </w:rPr>
-      <w:t>机动车变速箱及其零件对华进口依赖与供应风险分析报告 · 2026-07-23</w:t>
+      <w:t>机动车变速箱及其零件对华进口依赖与供应风险分析报告 · 2026-07-24</w:t>
     </w:r>
   </w:p>
 </w:ftr>

</xml_diff>